<commit_message>
fix: contrainte statut décisions bloquait en_cours/repondu/remporte/perdu
La table decisions n'autorisait en base que 'go'/'no_go'/'en_attente',
alors que l'app utilise 6 statuts depuis la v2. Toute tentative de
passage à "En cours" (manuelle ou automatique via la génération de
documents) était donc rejetée par Postgres. Migration SQL fournie
(supabase/migration_fix_decisions_statut.sql) + schema.sql corrigé.

Complète aussi le contenu ATTRI1 (coordonnées bancaires, date de début
d'exécution) et DC2 (mention sous-traitance) suite à une relecture de
complétude, et rend visible une éventuelle erreur lors du passage
auto en "En cours".
</commit_message>
<xml_diff>
--- a/assets/templates/ATTRI1.docx
+++ b/assets/templates/ATTRI1.docx
@@ -226,6 +226,21 @@
           <w:b/>
           <w:bCs/>
         </w:rPr>
+        <w:t xml:space="preserve">Date de début d’exécution : </w:t>
+      </w:r>
+      <w:r>
+        <w:t xml:space="preserve">{date_debut_execution}</w:t>
+      </w:r>
+    </w:p>
+    <w:p>
+      <w:pPr>
+        <w:spacing w:after="80"/>
+      </w:pPr>
+      <w:r>
+        <w:rPr>
+          <w:b/>
+          <w:bCs/>
+        </w:rPr>
         <w:t xml:space="preserve">Délai proposé : </w:t>
       </w:r>
       <w:r>
@@ -248,7 +263,71 @@
         <w:pStyle w:val="Heading2"/>
       </w:pPr>
       <w:r>
-        <w:t xml:space="preserve">4. Engagement</w:t>
+        <w:t xml:space="preserve">4. Coordonnées bancaires</w:t>
+      </w:r>
+    </w:p>
+    <w:p>
+      <w:pPr>
+        <w:spacing w:after="80"/>
+      </w:pPr>
+      <w:r>
+        <w:rPr>
+          <w:b/>
+          <w:bCs/>
+        </w:rPr>
+        <w:t xml:space="preserve">Banque : </w:t>
+      </w:r>
+      <w:r>
+        <w:t xml:space="preserve">{banque_nom}</w:t>
+      </w:r>
+    </w:p>
+    <w:p>
+      <w:pPr>
+        <w:spacing w:after="80"/>
+      </w:pPr>
+      <w:r>
+        <w:rPr>
+          <w:b/>
+          <w:bCs/>
+        </w:rPr>
+        <w:t xml:space="preserve">IBAN : </w:t>
+      </w:r>
+      <w:r>
+        <w:t xml:space="preserve">{iban}</w:t>
+      </w:r>
+    </w:p>
+    <w:p>
+      <w:pPr>
+        <w:spacing w:after="80"/>
+      </w:pPr>
+      <w:r>
+        <w:rPr>
+          <w:b/>
+          <w:bCs/>
+        </w:rPr>
+        <w:t xml:space="preserve">BIC : </w:t>
+      </w:r>
+      <w:r>
+        <w:t xml:space="preserve">{bic}</w:t>
+      </w:r>
+    </w:p>
+    <w:p>
+      <w:pPr>
+        <w:pBdr>
+          <w:bottom w:val="single" w:color="2E75B6" w:sz="6" w:space="1"/>
+        </w:pBdr>
+        <w:spacing w:after="200"/>
+      </w:pPr>
+      <w:r>
+        <w:t xml:space="preserve"/>
+      </w:r>
+    </w:p>
+    <w:p>
+      <w:pPr>
+        <w:pStyle w:val="Heading2"/>
+      </w:pPr>
+      <w:r>
+        <w:t xml:space="preserve">5. Engagement</w:t>
       </w:r>
     </w:p>
     <w:p>

</xml_diff>